<commit_message>
Onboarding v2: shorter Claude Design and Claude Code guides
</commit_message>
<xml_diff>
--- a/onboarding/AIX-Lab-Atlas-Skills-in-Claude-Code.docx
+++ b/onboarding/AIX-Lab-Atlas-Skills-in-Claude-Code.docx
@@ -178,7 +178,7 @@
     </w:p>
     <w:p>
       <w:r>
-        <w:t xml:space="preserve">The repository holds 30 skills. Each skill is a folder with a </w:t>
+        <w:t xml:space="preserve">The repository holds 30 skills, each a folder with a </w:t>
       </w:r>
       <w:r>
         <w:rPr>
@@ -187,34 +187,7 @@
         <w:t xml:space="preserve">SKILL.md</w:t>
       </w:r>
       <w:r>
-        <w:t xml:space="preserve"> file of instructions, for example </w:t>
-      </w:r>
-      <w:r>
-        <w:rPr>
-          <w:rStyle w:val="CodeChar"/>
-        </w:rPr>
-        <w:t xml:space="preserve">audit</w:t>
-      </w:r>
-      <w:r>
-        <w:t xml:space="preserve">, </w:t>
-      </w:r>
-      <w:r>
-        <w:rPr>
-          <w:rStyle w:val="CodeChar"/>
-        </w:rPr>
-        <w:t xml:space="preserve">brief</w:t>
-      </w:r>
-      <w:r>
-        <w:t xml:space="preserve"> and </w:t>
-      </w:r>
-      <w:r>
-        <w:rPr>
-          <w:rStyle w:val="CodeChar"/>
-        </w:rPr>
-        <w:t xml:space="preserve">persona</w:t>
-      </w:r>
-      <w:r>
-        <w:t xml:space="preserve">. You copy those folders to one place on your computer. After that, Claude Code can run any skill by name, in any project.</w:t>
+        <w:t xml:space="preserve"> file. You copy those folders to one place on your computer, and Claude Code then runs any skill by name.</w:t>
       </w:r>
     </w:p>
     <w:p>
@@ -1216,7 +1189,7 @@
         <w:rPr>
           <w:b/>
         </w:rPr>
-        <w:t xml:space="preserve">Audit modes.</w:t>
+        <w:t xml:space="preserve">Audit modes:</w:t>
       </w:r>
       <w:r>
         <w:t xml:space="preserve"> </w:t>
@@ -1228,7 +1201,7 @@
         <w:t xml:space="preserve">craft</w:t>
       </w:r>
       <w:r>
-        <w:t xml:space="preserve"> scores five dimensions 0 to 4 and ranks a task list P0 to P3. </w:t>
+        <w:t xml:space="preserve">, </w:t>
       </w:r>
       <w:r>
         <w:rPr>
@@ -1237,7 +1210,7 @@
         <w:t xml:space="preserve">heuristic</w:t>
       </w:r>
       <w:r>
-        <w:t xml:space="preserve"> is a 12-point usability pass for when the audit has to stand as evidence. </w:t>
+        <w:t xml:space="preserve">, </w:t>
       </w:r>
       <w:r>
         <w:rPr>
@@ -1246,7 +1219,7 @@
         <w:t xml:space="preserve">a11y</w:t>
       </w:r>
       <w:r>
-        <w:t xml:space="preserve"> checks WCAG 2.1 and 2.2 AA. </w:t>
+        <w:t xml:space="preserve">, </w:t>
       </w:r>
       <w:r>
         <w:rPr>
@@ -1255,7 +1228,7 @@
         <w:t xml:space="preserve">code</w:t>
       </w:r>
       <w:r>
-        <w:t xml:space="preserve"> checks token use and structure. </w:t>
+        <w:t xml:space="preserve">, </w:t>
       </w:r>
       <w:r>
         <w:rPr>
@@ -1264,7 +1237,7 @@
         <w:t xml:space="preserve">spec</w:t>
       </w:r>
       <w:r>
-        <w:t xml:space="preserve"> checks the build against the approved design. Audit only finds problems; run </w:t>
+        <w:t xml:space="preserve">. Audit only finds problems; run </w:t>
       </w:r>
       <w:r>
         <w:rPr>
@@ -1273,7 +1246,7 @@
         <w:t xml:space="preserve">/refine</w:t>
       </w:r>
       <w:r>
-        <w:t xml:space="preserve"> to fix them. Never average craft and heuristic scores.</w:t>
+        <w:t xml:space="preserve"> to fix them.</w:t>
       </w:r>
     </w:p>
     <w:p>
@@ -1299,7 +1272,7 @@
         <w:t xml:space="preserve">Plan first.</w:t>
       </w:r>
       <w:r>
-        <w:t xml:space="preserve"> Turn on plan mode (the mode selector near the prompt box, or Shift+Tab). Claude shows a plan and waits for your yes before it changes anything.</w:t>
+        <w:t xml:space="preserve"> Turn on plan mode (the mode selector near the prompt box, or Shift+Tab). Claude shows a plan and waits for your yes.</w:t>
       </w:r>
     </w:p>
     <w:p>
@@ -1317,7 +1290,7 @@
         <w:t xml:space="preserve">No invented evidence.</w:t>
       </w:r>
       <w:r>
-        <w:t xml:space="preserve"> No made-up people, quotes, numbers or competitors. If something is missing, it goes on a line in </w:t>
+        <w:t xml:space="preserve"> No made-up people, quotes, numbers or competitors. Missing facts go in </w:t>
       </w:r>
       <w:r>
         <w:rPr>
@@ -1326,7 +1299,7 @@
         <w:t xml:space="preserve">UNKNOWNS.md</w:t>
       </w:r>
       <w:r>
-        <w:t xml:space="preserve"> and Claude asks you. A guess must be labelled as a guess.</w:t>
+        <w:t xml:space="preserve">. Label a guess as a guess and name the source of every finding.</w:t>
       </w:r>
     </w:p>
     <w:p>
@@ -1341,51 +1314,15 @@
         <w:rPr>
           <w:b/>
         </w:rPr>
-        <w:t xml:space="preserve">Name the source</w:t>
-      </w:r>
-      <w:r>
-        <w:t xml:space="preserve"> of every finding: the file, the screen, or your words.</w:t>
-      </w:r>
-    </w:p>
-    <w:p>
-      <w:pPr>
-        <w:pStyle w:val="ListParagraph"/>
-        <w:numPr>
-          <w:ilvl w:val="0"/>
-          <w:numId w:val="1"/>
-        </w:numPr>
-      </w:pPr>
-      <w:r>
-        <w:rPr>
-          <w:b/>
-        </w:rPr>
         <w:t xml:space="preserve">Stay in scope.</w:t>
       </w:r>
       <w:r>
-        <w:t xml:space="preserve"> Practise in a folder of your own with an invented idea, never client material. Never paste passwords, keys or tokens into a chat. Keep Claude on its default, which asks before editing.</w:t>
-      </w:r>
-    </w:p>
-    <w:p>
-      <w:pPr>
-        <w:pStyle w:val="ListParagraph"/>
-        <w:numPr>
-          <w:ilvl w:val="0"/>
-          <w:numId w:val="1"/>
-        </w:numPr>
-      </w:pPr>
-      <w:r>
-        <w:rPr>
-          <w:b/>
-        </w:rPr>
-        <w:t xml:space="preserve">Never claim what did not happen.</w:t>
-      </w:r>
-      <w:r>
-        <w:t xml:space="preserve"> A skill must not say it wrote a file or ran a command when it did not.</w:t>
-      </w:r>
-    </w:p>
-    <w:p>
-      <w:r>
-        <w:t xml:space="preserve">Paste this before a skill run to enforce them:</w:t>
+        <w:t xml:space="preserve"> Practise on an invented idea in a folder of your own, never client material. Never paste passwords, keys or tokens into a chat.</w:t>
+      </w:r>
+    </w:p>
+    <w:p>
+      <w:r>
+        <w:t xml:space="preserve">To enforce these, paste before a skill run:</w:t>
       </w:r>
     </w:p>
     <w:p>
@@ -1435,16 +1372,13 @@
     </w:p>
     <w:p>
       <w:r>
-        <w:t xml:space="preserve">Three jobs come up again and again: connect a design system that already lives in Git, create a new one with foundations only, and (in Claude Design) bring in a component library and style guide from Figma. </w:t>
-      </w:r>
-      <w:r>
         <w:rPr>
           <w:b/>
         </w:rPr>
         <w:t xml:space="preserve">Foundations</w:t>
       </w:r>
       <w:r>
-        <w:t xml:space="preserve"> means the base tokens: colour, typography, spacing, radius and shadow, in light and dark. It does not include components.</w:t>
+        <w:t xml:space="preserve"> means colour, type, spacing, radius and shadow in light and dark, with no components.</w:t>
       </w:r>
     </w:p>
     <w:p>
@@ -1453,19 +1387,6 @@
       </w:pPr>
       <w:r>
         <w:t xml:space="preserve">1. Connect a design system from Git</w:t>
-      </w:r>
-    </w:p>
-    <w:p>
-      <w:r>
-        <w:t xml:space="preserve">Pick the case that matches your repository.</w:t>
-      </w:r>
-    </w:p>
-    <w:p>
-      <w:r>
-        <w:rPr>
-          <w:b/>
-        </w:rPr>
-        <w:t xml:space="preserve">Case A: it is a React component library and you want Claude Design to use it.</w:t>
       </w:r>
     </w:p>
     <w:p>
@@ -1477,7 +1398,7 @@
         </w:numPr>
       </w:pPr>
       <w:r>
-        <w:t xml:space="preserve">Download the repository as a ZIP (green </w:t>
+        <w:t xml:space="preserve">Unzip the repository and choose its folder in the </w:t>
       </w:r>
       <w:r>
         <w:rPr>
@@ -1486,49 +1407,7 @@
         <w:t xml:space="preserve">Code</w:t>
       </w:r>
       <w:r>
-        <w:t xml:space="preserve"> button, then </w:t>
-      </w:r>
-      <w:r>
-        <w:rPr>
-          <w:b/>
-        </w:rPr>
-        <w:t xml:space="preserve">Download ZIP</w:t>
-      </w:r>
-      <w:r>
-        <w:t xml:space="preserve">) and unzip it. For a private repository, sign in with an invited account first.</w:t>
-      </w:r>
-    </w:p>
-    <w:p>
-      <w:pPr>
-        <w:pStyle w:val="ListParagraph"/>
-        <w:numPr>
-          <w:ilvl w:val="0"/>
-          <w:numId w:val="6"/>
-        </w:numPr>
-      </w:pPr>
-      <w:r>
-        <w:t xml:space="preserve">Open the Claude desktop app, open the </w:t>
-      </w:r>
-      <w:r>
-        <w:rPr>
-          <w:b/>
-        </w:rPr>
-        <w:t xml:space="preserve">Code</w:t>
-      </w:r>
-      <w:r>
-        <w:t xml:space="preserve"> tab, and choose the unzipped folder as the working folder.</w:t>
-      </w:r>
-    </w:p>
-    <w:p>
-      <w:pPr>
-        <w:pStyle w:val="ListParagraph"/>
-        <w:numPr>
-          <w:ilvl w:val="0"/>
-          <w:numId w:val="6"/>
-        </w:numPr>
-      </w:pPr>
-      <w:r>
-        <w:t xml:space="preserve">Type </w:t>
+        <w:t xml:space="preserve"> tab. For a React component library, type </w:t>
       </w:r>
       <w:r>
         <w:rPr>
@@ -1537,19 +1416,7 @@
         <w:t xml:space="preserve">/design-sync</w:t>
       </w:r>
       <w:r>
-        <w:t xml:space="preserve"> and press Enter. Follow the prompts. On a large library it can take a long time and may ask you to confirm the cost. Only confirm if you accept it.</w:t>
-      </w:r>
-    </w:p>
-    <w:p>
-      <w:pPr>
-        <w:pStyle w:val="ListParagraph"/>
-        <w:numPr>
-          <w:ilvl w:val="0"/>
-          <w:numId w:val="6"/>
-        </w:numPr>
-      </w:pPr>
-      <w:r>
-        <w:t xml:space="preserve">Open </w:t>
+        <w:t xml:space="preserve"> and follow the prompts. A large library can take a long time and may ask you to confirm the cost. Then open </w:t>
       </w:r>
       <w:hyperlink r:id="rIdL3" w:history="1">
         <w:r>
@@ -1560,7 +1427,7 @@
         </w:r>
       </w:hyperlink>
       <w:r>
-        <w:t xml:space="preserve">, go to </w:t>
+        <w:t xml:space="preserve">, check the system under </w:t>
       </w:r>
       <w:r>
         <w:rPr>
@@ -1569,7 +1436,7 @@
         <w:t xml:space="preserve">Settings &gt; Design systems</w:t>
       </w:r>
       <w:r>
-        <w:t xml:space="preserve">, and check the new system is listed. Turn on </w:t>
+        <w:t xml:space="preserve">, and turn on </w:t>
       </w:r>
       <w:r>
         <w:rPr>
@@ -1578,47 +1445,63 @@
         <w:t xml:space="preserve">Published</w:t>
       </w:r>
       <w:r>
-        <w:t xml:space="preserve"> so new projects use it.</w:t>
-      </w:r>
-    </w:p>
-    <w:p>
-      <w:pPr>
-        <w:pStyle w:val="CalloutCheck"/>
-      </w:pPr>
-      <w:r>
-        <w:rPr>
-          <w:b/>
-        </w:rPr>
-        <w:t xml:space="preserve">Check: </w:t>
-      </w:r>
-      <w:r>
-        <w:t xml:space="preserve">The system appears under </w:t>
-      </w:r>
-      <w:r>
-        <w:rPr>
-          <w:b/>
-        </w:rPr>
-        <w:t xml:space="preserve">Settings &gt; Design systems</w:t>
-      </w:r>
-      <w:r>
-        <w:t xml:space="preserve">. </w:t>
-      </w:r>
-      <w:r>
-        <w:rPr>
-          <w:rStyle w:val="CodeChar"/>
-        </w:rPr>
-        <w:t xml:space="preserve">/design-sync</w:t>
-      </w:r>
-      <w:r>
-        <w:t xml:space="preserve"> works with React libraries. For other code, use the Claude Design route in the Claude Design sheet.</w:t>
-      </w:r>
-    </w:p>
-    <w:p>
-      <w:r>
-        <w:rPr>
-          <w:b/>
-        </w:rPr>
-        <w:t xml:space="preserve">Case B: you want the tokens documented in this suite, whatever the code is.</w:t>
+        <w:t xml:space="preserve">.</w:t>
+      </w:r>
+    </w:p>
+    <w:p>
+      <w:pPr>
+        <w:pStyle w:val="ListParagraph"/>
+        <w:numPr>
+          <w:ilvl w:val="0"/>
+          <w:numId w:val="6"/>
+        </w:numPr>
+      </w:pPr>
+      <w:r>
+        <w:t xml:space="preserve">For any other code, type </w:t>
+      </w:r>
+      <w:r>
+        <w:rPr>
+          <w:rStyle w:val="CodeChar"/>
+        </w:rPr>
+        <w:t xml:space="preserve">/styleguide</w:t>
+      </w:r>
+      <w:r>
+        <w:t xml:space="preserve"> and send: </w:t>
+      </w:r>
+      <w:r>
+        <w:rPr>
+          <w:rStyle w:val="CodeChar"/>
+        </w:rPr>
+        <w:t xml:space="preserve">Audit and document the design tokens in this project. Do not change any value.</w:t>
+      </w:r>
+      <w:r>
+        <w:t xml:space="preserve"> Read the </w:t>
+      </w:r>
+      <w:r>
+        <w:rPr>
+          <w:rStyle w:val="CodeChar"/>
+        </w:rPr>
+        <w:t xml:space="preserve">DESIGN.md</w:t>
+      </w:r>
+      <w:r>
+        <w:t xml:space="preserve"> it writes. Anything unclear goes on a line in </w:t>
+      </w:r>
+      <w:r>
+        <w:rPr>
+          <w:rStyle w:val="CodeChar"/>
+        </w:rPr>
+        <w:t xml:space="preserve">UNKNOWNS.md</w:t>
+      </w:r>
+      <w:r>
+        <w:t xml:space="preserve">.</w:t>
+      </w:r>
+    </w:p>
+    <w:p>
+      <w:pPr>
+        <w:pStyle w:val="Heading2"/>
+      </w:pPr>
+      <w:r>
+        <w:t xml:space="preserve">2. Create a design system (foundations only)</w:t>
       </w:r>
     </w:p>
     <w:p>
@@ -1630,16 +1513,34 @@
         </w:numPr>
       </w:pPr>
       <w:r>
-        <w:t xml:space="preserve">Unzip the repository and choose its folder in the </w:t>
-      </w:r>
-      <w:r>
-        <w:rPr>
-          <w:b/>
-        </w:rPr>
-        <w:t xml:space="preserve">Code</w:t>
-      </w:r>
-      <w:r>
-        <w:t xml:space="preserve"> tab, as above.</w:t>
+        <w:t xml:space="preserve">Type </w:t>
+      </w:r>
+      <w:r>
+        <w:rPr>
+          <w:rStyle w:val="CodeChar"/>
+        </w:rPr>
+        <w:t xml:space="preserve">/styleguide</w:t>
+      </w:r>
+      <w:r>
+        <w:t xml:space="preserve"> and send: </w:t>
+      </w:r>
+      <w:r>
+        <w:rPr>
+          <w:rStyle w:val="CodeChar"/>
+        </w:rPr>
+        <w:t xml:space="preserve">Foundations only: colour, typography, spacing, radius and shadow, light and dark. No components.</w:t>
+      </w:r>
+      <w:r>
+        <w:t xml:space="preserve"> Add </w:t>
+      </w:r>
+      <w:r>
+        <w:rPr>
+          <w:rStyle w:val="CodeChar"/>
+        </w:rPr>
+        <w:t xml:space="preserve">Use forge mode.</w:t>
+      </w:r>
+      <w:r>
+        <w:t xml:space="preserve"> for a real brand, and give it your sources: a website, a brand guide, or hex codes. If two sources disagree it asks which wins.</w:t>
       </w:r>
     </w:p>
     <w:p>
@@ -1651,34 +1552,16 @@
         </w:numPr>
       </w:pPr>
       <w:r>
-        <w:t xml:space="preserve">Type </w:t>
-      </w:r>
-      <w:r>
-        <w:rPr>
-          <w:rStyle w:val="CodeChar"/>
-        </w:rPr>
-        <w:t xml:space="preserve">/styleguide</w:t>
-      </w:r>
-      <w:r>
-        <w:t xml:space="preserve"> and send: </w:t>
-      </w:r>
-      <w:r>
-        <w:rPr>
-          <w:rStyle w:val="CodeChar"/>
-        </w:rPr>
-        <w:t xml:space="preserve">Audit and document the design tokens in this project. Do not change any value.</w:t>
-      </w:r>
-    </w:p>
-    <w:p>
-      <w:pPr>
-        <w:pStyle w:val="ListParagraph"/>
-        <w:numPr>
-          <w:ilvl w:val="0"/>
-          <w:numId w:val="7"/>
-        </w:numPr>
-      </w:pPr>
-      <w:r>
-        <w:t xml:space="preserve">Read the </w:t>
+        <w:t xml:space="preserve">It writes </w:t>
+      </w:r>
+      <w:r>
+        <w:rPr>
+          <w:rStyle w:val="CodeChar"/>
+        </w:rPr>
+        <w:t xml:space="preserve">src/index.css</w:t>
+      </w:r>
+      <w:r>
+        <w:t xml:space="preserve">, the Tailwind mapping and </w:t>
       </w:r>
       <w:r>
         <w:rPr>
@@ -1687,16 +1570,7 @@
         <w:t xml:space="preserve">DESIGN.md</w:t>
       </w:r>
       <w:r>
-        <w:t xml:space="preserve"> it writes. Anything it could not work out from the code goes on a line in </w:t>
-      </w:r>
-      <w:r>
-        <w:rPr>
-          <w:rStyle w:val="CodeChar"/>
-        </w:rPr>
-        <w:t xml:space="preserve">UNKNOWNS.md</w:t>
-      </w:r>
-      <w:r>
-        <w:t xml:space="preserve"> and Claude asks you.</w:t>
+        <w:t xml:space="preserve">. With no project yet, it returns the text for you to save as files.</w:t>
       </w:r>
     </w:p>
     <w:p>
@@ -1710,178 +1584,26 @@
         <w:t xml:space="preserve">Check: </w:t>
       </w:r>
       <w:r>
+        <w:t xml:space="preserve">No hard-coded colours outside </w:t>
+      </w:r>
+      <w:r>
+        <w:rPr>
+          <w:rStyle w:val="CodeChar"/>
+        </w:rPr>
+        <w:t xml:space="preserve">index.css</w:t>
+      </w:r>
+      <w:r>
+        <w:t xml:space="preserve">, and </w:t>
+      </w:r>
+      <w:r>
         <w:rPr>
           <w:rStyle w:val="CodeChar"/>
         </w:rPr>
         <w:t xml:space="preserve">DESIGN.md</w:t>
       </w:r>
       <w:r>
-        <w:t xml:space="preserve"> exists, and every value in it points to a file in the repository. Nothing was changed.</w:t>
-      </w:r>
-    </w:p>
-    <w:p>
-      <w:pPr>
-        <w:pStyle w:val="Heading2"/>
-      </w:pPr>
-      <w:r>
-        <w:t xml:space="preserve">2. Create a design system (foundations only)</w:t>
-      </w:r>
-    </w:p>
-    <w:p>
-      <w:pPr>
-        <w:pStyle w:val="ListParagraph"/>
-        <w:numPr>
-          <w:ilvl w:val="0"/>
-          <w:numId w:val="8"/>
-        </w:numPr>
-      </w:pPr>
-      <w:r>
-        <w:t xml:space="preserve">Decide: do you have a real brand? If not, </w:t>
-      </w:r>
-      <w:r>
-        <w:rPr>
-          <w:rStyle w:val="CodeChar"/>
-        </w:rPr>
-        <w:t xml:space="preserve">/styleguide</w:t>
-      </w:r>
-      <w:r>
-        <w:t xml:space="preserve"> builds a placeholder palette, labelled as placeholder. If yes, give it your sources: a live website, a brand guide (PDF, Figma or document) or hex codes you type in.</w:t>
-      </w:r>
-    </w:p>
-    <w:p>
-      <w:pPr>
-        <w:pStyle w:val="ListParagraph"/>
-        <w:numPr>
-          <w:ilvl w:val="0"/>
-          <w:numId w:val="8"/>
-        </w:numPr>
-      </w:pPr>
-      <w:r>
-        <w:t xml:space="preserve">In the </w:t>
-      </w:r>
-      <w:r>
-        <w:rPr>
-          <w:b/>
-        </w:rPr>
-        <w:t xml:space="preserve">Code</w:t>
-      </w:r>
-      <w:r>
-        <w:t xml:space="preserve"> tab, type </w:t>
-      </w:r>
-      <w:r>
-        <w:rPr>
-          <w:rStyle w:val="CodeChar"/>
-        </w:rPr>
-        <w:t xml:space="preserve">/styleguide</w:t>
-      </w:r>
-      <w:r>
-        <w:t xml:space="preserve"> and send: </w:t>
-      </w:r>
-      <w:r>
-        <w:rPr>
-          <w:rStyle w:val="CodeChar"/>
-        </w:rPr>
-        <w:t xml:space="preserve">Foundations only: colour, typography, spacing, radius and shadow, light and dark. No components.</w:t>
-      </w:r>
-      <w:r>
-        <w:t xml:space="preserve"> For a real brand add: </w:t>
-      </w:r>
-      <w:r>
-        <w:rPr>
-          <w:rStyle w:val="CodeChar"/>
-        </w:rPr>
-        <w:t xml:space="preserve">Use forge mode.</w:t>
-      </w:r>
-    </w:p>
-    <w:p>
-      <w:pPr>
-        <w:pStyle w:val="ListParagraph"/>
-        <w:numPr>
-          <w:ilvl w:val="0"/>
-          <w:numId w:val="8"/>
-        </w:numPr>
-      </w:pPr>
-      <w:r>
-        <w:t xml:space="preserve">Answer its questions. If two sources disagree, for example the guide says one blue and the website shows another, it asks which wins. Tints it works out itself are labelled "computed, not brand-verified".</w:t>
-      </w:r>
-    </w:p>
-    <w:p>
-      <w:pPr>
-        <w:pStyle w:val="ListParagraph"/>
-        <w:numPr>
-          <w:ilvl w:val="0"/>
-          <w:numId w:val="8"/>
-        </w:numPr>
-      </w:pPr>
-      <w:r>
-        <w:t xml:space="preserve">It writes </w:t>
-      </w:r>
-      <w:r>
-        <w:rPr>
-          <w:rStyle w:val="CodeChar"/>
-        </w:rPr>
-        <w:t xml:space="preserve">src/index.css</w:t>
-      </w:r>
-      <w:r>
-        <w:t xml:space="preserve"> (the raw brand palette plus the semantic roles, light and dark), the Tailwind mapping and </w:t>
-      </w:r>
-      <w:r>
-        <w:rPr>
-          <w:rStyle w:val="CodeChar"/>
-        </w:rPr>
-        <w:t xml:space="preserve">DESIGN.md</w:t>
-      </w:r>
-      <w:r>
-        <w:t xml:space="preserve">. With no project yet, tell it so. It then returns the token block and the </w:t>
-      </w:r>
-      <w:r>
-        <w:rPr>
-          <w:rStyle w:val="CodeChar"/>
-        </w:rPr>
-        <w:t xml:space="preserve">DESIGN.md</w:t>
-      </w:r>
-      <w:r>
-        <w:t xml:space="preserve"> text in the conversation, and you save them as files.</w:t>
-      </w:r>
-    </w:p>
-    <w:p>
-      <w:pPr>
-        <w:pStyle w:val="CalloutCheck"/>
-      </w:pPr>
-      <w:r>
-        <w:rPr>
-          <w:b/>
-        </w:rPr>
-        <w:t xml:space="preserve">Check: </w:t>
-      </w:r>
-      <w:r>
-        <w:rPr>
-          <w:rStyle w:val="CodeChar"/>
-        </w:rPr>
-        <w:t xml:space="preserve">index.css</w:t>
-      </w:r>
-      <w:r>
-        <w:t xml:space="preserve"> has one variable for every role in the skill's role list, in light and dark, and a search for hard-coded colours outside </w:t>
-      </w:r>
-      <w:r>
-        <w:rPr>
-          <w:rStyle w:val="CodeChar"/>
-        </w:rPr>
-        <w:t xml:space="preserve">index.css</w:t>
-      </w:r>
-      <w:r>
-        <w:t xml:space="preserve"> finds none.</w:t>
-      </w:r>
-    </w:p>
-    <w:p>
-      <w:pPr>
-        <w:pStyle w:val="Heading2"/>
-      </w:pPr>
-      <w:r>
-        <w:t xml:space="preserve">3. Figma library to tokens</w:t>
-      </w:r>
-    </w:p>
-    <w:p>
+        <w:t xml:space="preserve"> exists. To pull a Figma library into tokens, use </w:t>
+      </w:r>
       <w:r>
         <w:rPr>
           <w:rStyle w:val="CodeChar"/>
@@ -1889,43 +1611,7 @@
         <w:t xml:space="preserve">/figma</w:t>
       </w:r>
       <w:r>
-        <w:t xml:space="preserve"> in mode </w:t>
-      </w:r>
-      <w:r>
-        <w:rPr>
-          <w:rStyle w:val="CodeChar"/>
-        </w:rPr>
-        <w:t xml:space="preserve">import</w:t>
-      </w:r>
-      <w:r>
-        <w:t xml:space="preserve"> or </w:t>
-      </w:r>
-      <w:r>
-        <w:rPr>
-          <w:rStyle w:val="CodeChar"/>
-        </w:rPr>
-        <w:t xml:space="preserve">sync</w:t>
-      </w:r>
-      <w:r>
-        <w:t xml:space="preserve"> reads a Figma library through the Figma connector and writes its values into </w:t>
-      </w:r>
-      <w:r>
-        <w:rPr>
-          <w:rStyle w:val="CodeChar"/>
-        </w:rPr>
-        <w:t xml:space="preserve">index.css</w:t>
-      </w:r>
-      <w:r>
-        <w:t xml:space="preserve"> and </w:t>
-      </w:r>
-      <w:r>
-        <w:rPr>
-          <w:rStyle w:val="CodeChar"/>
-        </w:rPr>
-        <w:t xml:space="preserve">DESIGN.md</w:t>
-      </w:r>
-      <w:r>
-        <w:t xml:space="preserve">, asking before it overwrites anything. The connector is set up once. Ask the AIX-Lab support channel to do that for you. To bring a Figma component library and style guide into Claude Design itself, use the Claude Design sheet.</w:t>
+        <w:t xml:space="preserve"> with the connector the AIX-Lab support channel sets up once.</w:t>
       </w:r>
     </w:p>
     <w:p>
@@ -2097,7 +1783,7 @@
               <w:pStyle w:val="TableText"/>
             </w:pPr>
             <w:r>
-              <w:t xml:space="preserve">A skill writes before showing a plan</w:t>
+              <w:t xml:space="preserve">Anything else, or a skill writes before showing a plan</w:t>
             </w:r>
           </w:p>
         </w:tc>
@@ -2110,38 +1796,7 @@
               <w:pStyle w:val="TableText"/>
             </w:pPr>
             <w:r>
-              <w:t xml:space="preserve">Type: stop, show me your plan first.</w:t>
-            </w:r>
-          </w:p>
-        </w:tc>
-      </w:tr>
-      <w:tr>
-        <w:trPr>
-          <w:cantSplit/>
-        </w:trPr>
-        <w:tc>
-          <w:tcPr>
-            <w:tcW w:w="3830" w:type="dxa"/>
-          </w:tcPr>
-          <w:p>
-            <w:pPr>
-              <w:pStyle w:val="TableText"/>
-            </w:pPr>
-            <w:r>
-              <w:t xml:space="preserve">A skill says it cannot write a file or run a command</w:t>
-            </w:r>
-          </w:p>
-        </w:tc>
-        <w:tc>
-          <w:tcPr>
-            <w:tcW w:w="6250" w:type="dxa"/>
-          </w:tcPr>
-          <w:p>
-            <w:pPr>
-              <w:pStyle w:val="TableText"/>
-            </w:pPr>
-            <w:r>
-              <w:t xml:space="preserve">Take the output it returns in the conversation. Skills that build a prototype need a shell and may say so.</w:t>
+              <w:t xml:space="preserve">Type: stop, show me your plan first. Then call the AIX-Lab support channel.</w:t>
             </w:r>
           </w:p>
         </w:tc>
@@ -2283,12 +1938,6 @@
     </w:lvlOverride>
   </w:num>
   <w:num w:numId="7">
-    <w:abstractNumId w:val="1"/>
-    <w:lvlOverride w:ilvl="0">
-      <w:startOverride w:val="1"/>
-    </w:lvlOverride>
-  </w:num>
-  <w:num w:numId="8">
     <w:abstractNumId w:val="1"/>
     <w:lvlOverride w:ilvl="0">
       <w:startOverride w:val="1"/>

</xml_diff>